<commit_message>
info theory lab 1 docx
</commit_message>
<xml_diff>
--- a/semester_4/Теория информации/lab1/БПИ24-01_КарапетьянЯР_Лабораторная1_Отчёт.docx
+++ b/semester_4/Теория информации/lab1/БПИ24-01_КарапетьянЯР_Лабораторная1_Отчёт.docx
@@ -3002,9 +3002,6 @@
         <w:t>.</w:t>
       </w:r>
       <w:r>
-        <w:rPr>
-          <w:lang w:val="en-US"/>
-        </w:rPr>
         <w:t>1</w:t>
       </w:r>
       <w:r>
@@ -13571,6 +13568,52 @@
         </w:rPr>
         <w:t>Листинг программы Б.1</w:t>
       </w:r>
+      <w:r>
+        <w:rPr>
+          <w:color w:val="000000" w:themeColor="text1"/>
+        </w:rPr>
+        <w:t xml:space="preserve"> – </w:t>
+      </w:r>
+      <w:r>
+        <w:rPr>
+          <w:color w:val="000000" w:themeColor="text1"/>
+        </w:rPr>
+        <w:t xml:space="preserve">получение </w:t>
+      </w:r>
+      <w:r>
+        <w:rPr>
+          <w:color w:val="000000" w:themeColor="text1"/>
+        </w:rPr>
+        <w:t>-</w:t>
+      </w:r>
+      <w:proofErr w:type="spellStart"/>
+      <w:r>
+        <w:rPr>
+          <w:color w:val="000000" w:themeColor="text1"/>
+          <w:lang w:val="en-US"/>
+        </w:rPr>
+        <w:t>plog</w:t>
+      </w:r>
+      <w:proofErr w:type="spellEnd"/>
+      <w:r>
+        <w:rPr>
+          <w:color w:val="000000" w:themeColor="text1"/>
+        </w:rPr>
+        <w:t>2(</w:t>
+      </w:r>
+      <w:r>
+        <w:rPr>
+          <w:color w:val="000000" w:themeColor="text1"/>
+          <w:lang w:val="en-US"/>
+        </w:rPr>
+        <w:t>p</w:t>
+      </w:r>
+      <w:r>
+        <w:rPr>
+          <w:color w:val="000000" w:themeColor="text1"/>
+        </w:rPr>
+        <w:t>)</w:t>
+      </w:r>
     </w:p>
     <w:p>
       <w:pPr>
@@ -13920,7 +13963,6 @@
       <w:r>
         <w:rPr>
           <w:color w:val="000000" w:themeColor="text1"/>
-          <w:lang w:val="en-US"/>
         </w:rPr>
         <w:t xml:space="preserve"> </w:t>
       </w:r>
@@ -13933,7 +13975,6 @@
       <w:r>
         <w:rPr>
           <w:color w:val="000000" w:themeColor="text1"/>
-          <w:lang w:val="en-US"/>
         </w:rPr>
         <w:t xml:space="preserve"> </w:t>
       </w:r>
@@ -13946,7 +13987,6 @@
       <w:r>
         <w:rPr>
           <w:color w:val="000000" w:themeColor="text1"/>
-          <w:lang w:val="en-US"/>
         </w:rPr>
         <w:t>.</w:t>
       </w:r>
@@ -13955,6 +13995,56 @@
           <w:color w:val="000000" w:themeColor="text1"/>
         </w:rPr>
         <w:t>2</w:t>
+      </w:r>
+      <w:r>
+        <w:rPr>
+          <w:color w:val="000000" w:themeColor="text1"/>
+        </w:rPr>
+        <w:t xml:space="preserve"> </w:t>
+      </w:r>
+      <w:r>
+        <w:rPr>
+          <w:color w:val="000000" w:themeColor="text1"/>
+        </w:rPr>
+        <w:t>–</w:t>
+      </w:r>
+      <w:r>
+        <w:rPr>
+          <w:color w:val="000000" w:themeColor="text1"/>
+        </w:rPr>
+        <w:t xml:space="preserve"> </w:t>
+      </w:r>
+      <w:r>
+        <w:rPr>
+          <w:color w:val="000000" w:themeColor="text1"/>
+        </w:rPr>
+        <w:t xml:space="preserve">получение и вывод графика зависимости </w:t>
+      </w:r>
+      <w:r>
+        <w:rPr>
+          <w:color w:val="000000" w:themeColor="text1"/>
+          <w:lang w:val="en-US"/>
+        </w:rPr>
+        <w:t>n</w:t>
+      </w:r>
+      <w:r>
+        <w:rPr>
+          <w:color w:val="000000" w:themeColor="text1"/>
+        </w:rPr>
+        <w:t>(</w:t>
+      </w:r>
+      <w:r>
+        <w:rPr>
+          <w:color w:val="000000" w:themeColor="text1"/>
+          <w:lang w:val="en-US"/>
+        </w:rPr>
+        <w:t>p</w:t>
+      </w:r>
+      <w:r>
+        <w:rPr>
+          <w:color w:val="000000" w:themeColor="text1"/>
+        </w:rPr>
+        <w:t>)</w:t>
       </w:r>
     </w:p>
     <w:p>
@@ -13964,7 +14054,6 @@
         <w:rPr>
           <w:color w:val="7F7F7F" w:themeColor="text1" w:themeTint="80"/>
           <w:szCs w:val="24"/>
-          <w:lang w:val="en-US"/>
         </w:rPr>
       </w:pPr>
       <w:r>
@@ -13973,7 +14062,22 @@
           <w:szCs w:val="24"/>
           <w:lang w:val="en-US"/>
         </w:rPr>
-        <w:t>import math</w:t>
+        <w:t>import</w:t>
+      </w:r>
+      <w:r>
+        <w:rPr>
+          <w:color w:val="7F7F7F" w:themeColor="text1" w:themeTint="80"/>
+          <w:szCs w:val="24"/>
+        </w:rPr>
+        <w:t xml:space="preserve"> </w:t>
+      </w:r>
+      <w:r>
+        <w:rPr>
+          <w:color w:val="7F7F7F" w:themeColor="text1" w:themeTint="80"/>
+          <w:szCs w:val="24"/>
+          <w:lang w:val="en-US"/>
+        </w:rPr>
+        <w:t>math</w:t>
       </w:r>
     </w:p>
     <w:p>
@@ -13992,7 +14096,45 @@
           <w:szCs w:val="24"/>
           <w:lang w:val="en-US"/>
         </w:rPr>
-        <w:t xml:space="preserve">import matplotlib.pyplot as plt </w:t>
+        <w:t xml:space="preserve">import </w:t>
+      </w:r>
+      <w:proofErr w:type="spellStart"/>
+      <w:proofErr w:type="gramStart"/>
+      <w:r>
+        <w:rPr>
+          <w:color w:val="7F7F7F" w:themeColor="text1" w:themeTint="80"/>
+          <w:szCs w:val="24"/>
+          <w:lang w:val="en-US"/>
+        </w:rPr>
+        <w:t>matplotlib.pyplot</w:t>
+      </w:r>
+      <w:proofErr w:type="spellEnd"/>
+      <w:proofErr w:type="gramEnd"/>
+      <w:r>
+        <w:rPr>
+          <w:color w:val="7F7F7F" w:themeColor="text1" w:themeTint="80"/>
+          <w:szCs w:val="24"/>
+          <w:lang w:val="en-US"/>
+        </w:rPr>
+        <w:t xml:space="preserve"> as </w:t>
+      </w:r>
+      <w:proofErr w:type="spellStart"/>
+      <w:r>
+        <w:rPr>
+          <w:color w:val="7F7F7F" w:themeColor="text1" w:themeTint="80"/>
+          <w:szCs w:val="24"/>
+          <w:lang w:val="en-US"/>
+        </w:rPr>
+        <w:t>plt</w:t>
+      </w:r>
+      <w:proofErr w:type="spellEnd"/>
+      <w:r>
+        <w:rPr>
+          <w:color w:val="7F7F7F" w:themeColor="text1" w:themeTint="80"/>
+          <w:szCs w:val="24"/>
+          <w:lang w:val="en-US"/>
+        </w:rPr>
+        <w:t xml:space="preserve"> </w:t>
       </w:r>
     </w:p>
     <w:p>
@@ -14402,15 +14544,38 @@
         </w:rPr>
       </w:pPr>
     </w:p>
-    <w:p/>
-    <w:p/>
-    <w:p/>
-    <w:p/>
+    <w:p>
+      <w:pPr>
+        <w:rPr>
+          <w:lang w:val="en-US"/>
+        </w:rPr>
+      </w:pPr>
+    </w:p>
+    <w:p>
+      <w:pPr>
+        <w:rPr>
+          <w:lang w:val="en-US"/>
+        </w:rPr>
+      </w:pPr>
+    </w:p>
+    <w:p>
+      <w:pPr>
+        <w:rPr>
+          <w:lang w:val="en-US"/>
+        </w:rPr>
+      </w:pPr>
+    </w:p>
+    <w:p>
+      <w:pPr>
+        <w:rPr>
+          <w:lang w:val="en-US"/>
+        </w:rPr>
+      </w:pPr>
+    </w:p>
     <w:p>
       <w:pPr>
         <w:rPr>
           <w:color w:val="000000" w:themeColor="text1"/>
-          <w:lang w:val="en-US"/>
         </w:rPr>
       </w:pPr>
       <w:r>
@@ -14423,7 +14588,6 @@
       <w:r>
         <w:rPr>
           <w:color w:val="000000" w:themeColor="text1"/>
-          <w:lang w:val="en-US"/>
         </w:rPr>
         <w:t xml:space="preserve"> </w:t>
       </w:r>
@@ -14436,7 +14600,6 @@
       <w:r>
         <w:rPr>
           <w:color w:val="000000" w:themeColor="text1"/>
-          <w:lang w:val="en-US"/>
         </w:rPr>
         <w:t xml:space="preserve"> </w:t>
       </w:r>
@@ -14449,9 +14612,28 @@
       <w:r>
         <w:rPr>
           <w:color w:val="000000" w:themeColor="text1"/>
-          <w:lang w:val="en-US"/>
         </w:rPr>
         <w:t>.3</w:t>
+      </w:r>
+      <w:r>
+        <w:rPr>
+          <w:color w:val="000000" w:themeColor="text1"/>
+        </w:rPr>
+        <w:t xml:space="preserve"> – </w:t>
+      </w:r>
+      <w:proofErr w:type="spellStart"/>
+      <w:r>
+        <w:rPr>
+          <w:color w:val="000000" w:themeColor="text1"/>
+        </w:rPr>
+        <w:t>энтропиия</w:t>
+      </w:r>
+      <w:proofErr w:type="spellEnd"/>
+      <w:r>
+        <w:rPr>
+          <w:color w:val="000000" w:themeColor="text1"/>
+        </w:rPr>
+        <w:t xml:space="preserve"> русского алфавита по таблице</w:t>
       </w:r>
     </w:p>
     <w:p>
@@ -14933,7 +15115,6 @@
       <w:r>
         <w:rPr>
           <w:color w:val="000000" w:themeColor="text1"/>
-          <w:lang w:val="en-US"/>
         </w:rPr>
         <w:t xml:space="preserve"> </w:t>
       </w:r>
@@ -14946,7 +15127,6 @@
       <w:r>
         <w:rPr>
           <w:color w:val="000000" w:themeColor="text1"/>
-          <w:lang w:val="en-US"/>
         </w:rPr>
         <w:t xml:space="preserve"> </w:t>
       </w:r>
@@ -14959,15 +15139,14 @@
       <w:r>
         <w:rPr>
           <w:color w:val="000000" w:themeColor="text1"/>
-          <w:lang w:val="en-US"/>
-        </w:rPr>
-        <w:t>.</w:t>
+        </w:rPr>
+        <w:t>.4</w:t>
       </w:r>
       <w:r>
         <w:rPr>
           <w:color w:val="000000" w:themeColor="text1"/>
         </w:rPr>
-        <w:t>4</w:t>
+        <w:t xml:space="preserve"> – энтропия русского </w:t>
       </w:r>
     </w:p>
     <w:p>
@@ -15362,6 +15541,7 @@
       <w:r>
         <w:rPr>
           <w:color w:val="7F7F7F" w:themeColor="text1" w:themeTint="80"/>
+          <w:lang w:val="en-US"/>
         </w:rPr>
         <w:t xml:space="preserve">               </w:t>
       </w:r>
@@ -15391,7 +15571,23 @@
           <w:color w:val="7F7F7F" w:themeColor="text1" w:themeTint="80"/>
           <w:lang w:val="en-US"/>
         </w:rPr>
-        <w:t xml:space="preserve">for i in </w:t>
+        <w:t xml:space="preserve">for </w:t>
+      </w:r>
+      <w:proofErr w:type="spellStart"/>
+      <w:r>
+        <w:rPr>
+          <w:color w:val="7F7F7F" w:themeColor="text1" w:themeTint="80"/>
+          <w:lang w:val="en-US"/>
+        </w:rPr>
+        <w:t>i</w:t>
+      </w:r>
+      <w:proofErr w:type="spellEnd"/>
+      <w:r>
+        <w:rPr>
+          <w:color w:val="7F7F7F" w:themeColor="text1" w:themeTint="80"/>
+          <w:lang w:val="en-US"/>
+        </w:rPr>
+        <w:t xml:space="preserve"> in </w:t>
       </w:r>
       <w:proofErr w:type="spellStart"/>
       <w:proofErr w:type="gramStart"/>
@@ -15648,6 +15844,7 @@
         <w:jc w:val="both"/>
         <w:rPr>
           <w:sz w:val="28"/>
+          <w:lang w:val="en-US"/>
         </w:rPr>
       </w:pPr>
     </w:p>
@@ -15664,6 +15861,9 @@
     <w:p>
       <w:pPr>
         <w:pStyle w:val="afff4"/>
+        <w:rPr>
+          <w:lang w:val="en-US"/>
+        </w:rPr>
       </w:pPr>
       <w:r>
         <w:t>Приложение</w:t>

</xml_diff>